<commit_message>
Rebuild August 2026 intelligence with verified sources and Doubao translations
</commit_message>
<xml_diff>
--- a/reports/2026-08_cardura_focus_report.docx
+++ b/reports/2026-08_cardura_focus_report.docx
@@ -94,7 +94,7 @@
                 <w:sz w:val="34"/>
                 <w:szCs w:val="34"/>
               </w:rPr>
-              <w:t xml:space="preserve">45</w:t>
+              <w:t xml:space="preserve">2</w:t>
             </w:r>
           </w:p>
           <w:p>
@@ -139,7 +139,7 @@
                 <w:sz w:val="34"/>
                 <w:szCs w:val="34"/>
               </w:rPr>
-              <w:t xml:space="preserve">29</w:t>
+              <w:t xml:space="preserve">0</w:t>
             </w:r>
           </w:p>
           <w:p>
@@ -184,7 +184,7 @@
                 <w:sz w:val="34"/>
                 <w:szCs w:val="34"/>
               </w:rPr>
-              <w:t xml:space="preserve">24</w:t>
+              <w:t xml:space="preserve">0</w:t>
             </w:r>
           </w:p>
           <w:p>
@@ -380,7 +380,7 @@
                 <w:sz w:val="23"/>
                 <w:szCs w:val="23"/>
               </w:rPr>
-              <w:t xml:space="preserve">2026年8月可多华最值得注意的是：良性前列腺增生竞争持续围绕选择性 α1 阻滞剂、联合治疗和症状改善展开。</w:t>
+              <w:t xml:space="preserve">8月可确认的新论文集中在坦索罗辛安全性和缓释剂型，未见多沙唑嗪同成分的新疗效证据。</w:t>
             </w:r>
           </w:p>
         </w:tc>
@@ -438,7 +438,7 @@
                 <w:sz w:val="23"/>
                 <w:szCs w:val="23"/>
               </w:rPr>
-              <w:t xml:space="preserve">本月纳入 45 条有效产品/竞品进展，其中 29 条建议跟进、24 条为高证据。优先记录包括《坦索罗辛与西洛多辛治疗良性前列腺增生患者虹膜结构的变化》、《良性前列腺增生患者坦索罗辛与西洛多辛的瞳孔大小和脉络膜厚度变化》。</w:t>
+              <w:t xml:space="preserve">本月纳入 2 条有效产品/竞品进展，其中 0 条建议跟进、0 条为高证据。优先记录包括《两种0.4 mg缓释坦索罗辛制剂在墨西哥健康受试者中的生物等效性、食物影响评估及探索性体内外相关性研究。》、《接受非那雄胺和坦索罗辛治疗的男性的2型糖尿病发病率：一项基于中国和英国人群数据的交叉验证队列研究。》。</w:t>
             </w:r>
           </w:p>
         </w:tc>
@@ -496,7 +496,7 @@
                 <w:sz w:val="23"/>
                 <w:szCs w:val="23"/>
               </w:rPr>
-              <w:t xml:space="preserve">优先查看机制竞品；希爱力每日剂量、直接竞品；哈乐/Flomax、机制竞品；保法止/Proscar、机制竞品；安福达/Avodart，并把同一研究在不同检索路径下的重复命中合并判断。</w:t>
+              <w:t xml:space="preserve">优先查看直接竞品；哈乐/Flomax，并把同一研究在不同检索路径下的重复命中合并判断。</w:t>
             </w:r>
           </w:p>
         </w:tc>
@@ -772,7 +772,7 @@
                 <w:sz w:val="22"/>
                 <w:szCs w:val="22"/>
               </w:rPr>
-              <w:t xml:space="preserve">2026-08-03</w:t>
+              <w:t xml:space="preserve">2026-08-14</w:t>
             </w:r>
           </w:p>
           <w:p>
@@ -786,7 +786,7 @@
                 <w:sz w:val="22"/>
                 <w:szCs w:val="22"/>
               </w:rPr>
-              <w:t xml:space="preserve">Clinical</w:t>
+              <w:t xml:space="preserve">PubMed</w:t>
             </w:r>
           </w:p>
           <w:p>
@@ -796,11 +796,11 @@
             <w:r>
               <w:rPr>
                 <w:rFonts w:ascii="Microsoft YaHei UI" w:cs="Microsoft YaHei UI" w:eastAsia="Microsoft YaHei UI" w:hAnsi="Microsoft YaHei UI"/>
-                <w:color w:val="0B5C55"/>
+                <w:color w:val="9A5D15"/>
                 <w:sz w:val="18"/>
                 <w:szCs w:val="18"/>
               </w:rPr>
-              <w:t xml:space="preserve">高证据 / 建议跟进</w:t>
+              <w:t xml:space="preserve">中证据 / 视情况</w:t>
             </w:r>
           </w:p>
         </w:tc>
@@ -829,7 +829,7 @@
                 <w:sz w:val="22"/>
                 <w:szCs w:val="22"/>
               </w:rPr>
-              <w:t xml:space="preserve">坦索罗辛与西洛多辛治疗良性前列腺增生患者虹膜结构的变化</w:t>
+              <w:t xml:space="preserve">两种0.4 mg缓释坦索罗辛制剂在墨西哥健康受试者中的生物等效性、食物影响评估及探索性体内外相关性研究。</w:t>
             </w:r>
           </w:p>
           <w:p>
@@ -843,14 +843,14 @@
                 <w:sz w:val="20"/>
                 <w:szCs w:val="20"/>
               </w:rPr>
-              <w:t xml:space="preserve">ClinicalTrials.gov 研究：坦索罗辛与西洛多辛治疗良性前列腺增生患者虹膜结构的变化；NCT：NCT07743034；状态：尚未招募；阶段：4期；适应症/疾病：良性前列腺增生；坦索罗辛；西洛多辛；术中虹膜松弛综合征；断层扫描，光学相干；虹膜疾病；首次发布：2026-08-03；最近更新：2026-08-03。</w:t>
+              <w:t xml:space="preserve">论文内容：背景/目的：缓释（ER）坦索罗辛制剂可减少良性前列腺增生（BPH）治疗中与血药峰浓度相关的血管舒张不良事件。本研究评估了仿制药0.4 mg缓释坦索罗辛制剂与原研药在空腹和餐后状态下的药代动力学及生物等效性。方法：在墨西哥健康男性中开展两项随机、开放标签、四周期交叉单剂量试验。受试者在禁食10小时或进食高脂餐后接受治疗，洗脱期为7天。采用LC-MS/MS法测定72小时内的血浆坦索罗辛浓度，同时进行探索性体内外相关性（IVIVC）分析。结果：分析纳入32名（空腹）和58名（餐后）受试者。在两种状态下，Cmax、AUC0-t和AUC0-∞几何均数比值的90%置信区间完全落在80.00%~125.00%的生物等效性限值范围内。</w:t>
             </w:r>
           </w:p>
           <w:p>
             <w:pPr>
               <w:spacing w:after="0" w:before="80"/>
             </w:pPr>
-            <w:hyperlink w:history="1" r:id="rId7rqpuzagi1id0rp9ekon4">
+            <w:hyperlink w:history="1" r:id="rIdr6i_b7qmtd0uibv1afnou">
               <w:r>
                 <w:rPr>
                   <w:rFonts w:ascii="Microsoft YaHei UI" w:cs="Microsoft YaHei UI" w:eastAsia="Microsoft YaHei UI" w:hAnsi="Microsoft YaHei UI"/>
@@ -903,7 +903,7 @@
                 <w:sz w:val="20"/>
                 <w:szCs w:val="20"/>
               </w:rPr>
-              <w:t xml:space="preserve">BPH 一线替代；建议查看研究设计、入排标准和终点，判断对可多华或同机制竞品监测的影响。</w:t>
+              <w:t xml:space="preserve">该文涉及盐酸坦索罗辛及可多华的直接竞品追踪路径；应依据原文研究人群、终点与研究设计判断临床适用性，不把题名当作疗效结论。</w:t>
             </w:r>
           </w:p>
         </w:tc>
@@ -937,7 +937,7 @@
                 <w:sz w:val="22"/>
                 <w:szCs w:val="22"/>
               </w:rPr>
-              <w:t xml:space="preserve">2026-08-03</w:t>
+              <w:t xml:space="preserve">2026-08-06</w:t>
             </w:r>
           </w:p>
           <w:p>
@@ -951,7 +951,7 @@
                 <w:sz w:val="22"/>
                 <w:szCs w:val="22"/>
               </w:rPr>
-              <w:t xml:space="preserve">Clinical</w:t>
+              <w:t xml:space="preserve">PubMed</w:t>
             </w:r>
           </w:p>
           <w:p>
@@ -961,11 +961,11 @@
             <w:r>
               <w:rPr>
                 <w:rFonts w:ascii="Microsoft YaHei UI" w:cs="Microsoft YaHei UI" w:eastAsia="Microsoft YaHei UI" w:hAnsi="Microsoft YaHei UI"/>
-                <w:color w:val="0B5C55"/>
+                <w:color w:val="9A5D15"/>
                 <w:sz w:val="18"/>
                 <w:szCs w:val="18"/>
               </w:rPr>
-              <w:t xml:space="preserve">高证据 / 建议跟进</w:t>
+              <w:t xml:space="preserve">中证据 / 视情况</w:t>
             </w:r>
           </w:p>
         </w:tc>
@@ -994,7 +994,7 @@
                 <w:sz w:val="22"/>
                 <w:szCs w:val="22"/>
               </w:rPr>
-              <w:t xml:space="preserve">良性前列腺增生患者坦索罗辛与西洛多辛的瞳孔大小和脉络膜厚度变化</w:t>
+              <w:t xml:space="preserve">接受非那雄胺和坦索罗辛治疗的男性的2型糖尿病发病率：一项基于中国和英国人群数据的交叉验证队列研究。</w:t>
             </w:r>
           </w:p>
           <w:p>
@@ -1008,14 +1008,14 @@
                 <w:sz w:val="20"/>
                 <w:szCs w:val="20"/>
               </w:rPr>
-              <w:t xml:space="preserve">ClinicalTrials.gov 研究：良性前列腺增生患者坦索罗辛与西洛多辛的瞳孔大小和脉络膜厚度变化；NCT：NCT07743060；状态：尚未招募；阶段：4期；适应症/疾病：良性前列腺增生；西洛多辛；坦索罗辛；脉络膜；虹膜疾病；断层扫描，光学相干；首次发布：2026-08-03；最近更新：2026-08-03。</w:t>
+              <w:t xml:space="preserve">论文内容：目的：探究中国和英国人群中使用非那雄胺与坦索罗辛相关的T2DM发病率。方法：本研究利用中国的厦门居民电子健康记录交换平台（EXPLORER）数据库和英国生物样本库（UKB），纳入年龄在40-80岁、确诊为良性前列腺增生的男性。采用Cox模型并结合重叠加权法估算风险比（HRs）及95%置信区间（CIs）。结果：EXPLORER队列包含34075名患者，其中21399名未接受治疗，2122名接受非那雄胺单药治疗，5012名接受坦索罗辛单药治疗，5542名接受联合治疗。UKB队列纳入11905例患者，其中7050例未接受治疗，492例接受非那雄胺单药治疗，3105例接受坦索罗辛单药治疗，1258例接受联合治疗。</w:t>
             </w:r>
           </w:p>
           <w:p>
             <w:pPr>
               <w:spacing w:after="0" w:before="80"/>
             </w:pPr>
-            <w:hyperlink w:history="1" r:id="rIdfq6hdqobcon79fcbtbugg">
+            <w:hyperlink w:history="1" r:id="rIde8o9euh8bdh5pldk8hnzs">
               <w:r>
                 <w:rPr>
                   <w:rFonts w:ascii="Microsoft YaHei UI" w:cs="Microsoft YaHei UI" w:eastAsia="Microsoft YaHei UI" w:hAnsi="Microsoft YaHei UI"/>
@@ -1068,997 +1068,7 @@
                 <w:sz w:val="20"/>
                 <w:szCs w:val="20"/>
               </w:rPr>
-              <w:t xml:space="preserve">BPH 一线替代；建议查看研究设计、入排标准和终点，判断对可多华或同机制竞品监测的影响。</w:t>
-            </w:r>
-          </w:p>
-        </w:tc>
-      </w:tr>
-      <w:tr>
-        <w:trPr>
-          <w:cantSplit/>
-        </w:trPr>
-        <w:tc>
-          <w:tcPr>
-            <w:tcW w:type="dxa" w:w="1450"/>
-            <w:shd w:fill="FFFFFF" w:val="clear"/>
-            <w:tcMar>
-              <w:top w:type="dxa" w:w="150"/>
-              <w:left w:type="dxa" w:w="170"/>
-              <w:bottom w:type="dxa" w:w="150"/>
-              <w:right w:type="dxa" w:w="170"/>
-            </w:tcMar>
-            <w:vAlign w:val="center"/>
-          </w:tcPr>
-          <w:p>
-            <w:pPr>
-              <w:spacing w:after="60" w:before="0" w:line="340"/>
-            </w:pPr>
-            <w:r>
-              <w:rPr>
-                <w:rFonts w:ascii="Microsoft YaHei UI" w:cs="Microsoft YaHei UI" w:eastAsia="Microsoft YaHei UI" w:hAnsi="Microsoft YaHei UI"/>
-                <w:b/>
-                <w:bCs/>
-                <w:color w:val="152625"/>
-                <w:sz w:val="22"/>
-                <w:szCs w:val="22"/>
-              </w:rPr>
-              <w:t xml:space="preserve">2026-08-12</w:t>
-            </w:r>
-          </w:p>
-          <w:p>
-            <w:pPr>
-              <w:spacing w:after="60" w:before="0" w:line="340"/>
-            </w:pPr>
-            <w:r>
-              <w:rPr>
-                <w:rFonts w:ascii="Microsoft YaHei UI" w:cs="Microsoft YaHei UI" w:eastAsia="Microsoft YaHei UI" w:hAnsi="Microsoft YaHei UI"/>
-                <w:color w:val="5F706E"/>
-                <w:sz w:val="22"/>
-                <w:szCs w:val="22"/>
-              </w:rPr>
-              <w:t xml:space="preserve">Clinical</w:t>
-            </w:r>
-          </w:p>
-          <w:p>
-            <w:pPr>
-              <w:spacing w:after="0" w:before="0" w:line="340"/>
-            </w:pPr>
-            <w:r>
-              <w:rPr>
-                <w:rFonts w:ascii="Microsoft YaHei UI" w:cs="Microsoft YaHei UI" w:eastAsia="Microsoft YaHei UI" w:hAnsi="Microsoft YaHei UI"/>
-                <w:color w:val="0B5C55"/>
-                <w:sz w:val="18"/>
-                <w:szCs w:val="18"/>
-              </w:rPr>
-              <w:t xml:space="preserve">高证据 / 建议跟进</w:t>
-            </w:r>
-          </w:p>
-        </w:tc>
-        <w:tc>
-          <w:tcPr>
-            <w:tcW w:type="dxa" w:w="5400"/>
-            <w:shd w:fill="FFFFFF" w:val="clear"/>
-            <w:tcMar>
-              <w:top w:type="dxa" w:w="150"/>
-              <w:left w:type="dxa" w:w="170"/>
-              <w:bottom w:type="dxa" w:w="150"/>
-              <w:right w:type="dxa" w:w="170"/>
-            </w:tcMar>
-            <w:vAlign w:val="top"/>
-          </w:tcPr>
-          <w:p>
-            <w:pPr>
-              <w:spacing w:after="80" w:before="0" w:line="340"/>
-            </w:pPr>
-            <w:r>
-              <w:rPr>
-                <w:rFonts w:ascii="Microsoft YaHei UI" w:cs="Microsoft YaHei UI" w:eastAsia="Microsoft YaHei UI" w:hAnsi="Microsoft YaHei UI"/>
-                <w:b/>
-                <w:bCs/>
-                <w:color w:val="152625"/>
-                <w:sz w:val="22"/>
-                <w:szCs w:val="22"/>
-              </w:rPr>
-              <w:t xml:space="preserve">PRP、PDE5抑制剂治疗勃起功能障碍的效果比较</w:t>
-            </w:r>
-          </w:p>
-          <w:p>
-            <w:pPr>
-              <w:spacing w:after="0" w:before="0" w:line="320"/>
-            </w:pPr>
-            <w:r>
-              <w:rPr>
-                <w:rFonts w:ascii="Microsoft YaHei UI" w:cs="Microsoft YaHei UI" w:eastAsia="Microsoft YaHei UI" w:hAnsi="Microsoft YaHei UI"/>
-                <w:color w:val="5F706E"/>
-                <w:sz w:val="20"/>
-                <w:szCs w:val="20"/>
-              </w:rPr>
-              <w:t xml:space="preserve">ClinicalTrials.gov 研究：PRP、PDE5抑制剂治疗勃起功能障碍的效果比较；NCT：NCT07761806；状态：已完成；阶段：2期；3期；适应症/疾病：勃起功能障碍；首次发布：2026-08-12；最近更新：2026-08-12。</w:t>
-            </w:r>
-          </w:p>
-          <w:p>
-            <w:pPr>
-              <w:spacing w:after="0" w:before="80"/>
-            </w:pPr>
-            <w:hyperlink w:history="1" r:id="rIdalwjfv4usxd9ocnehpk6w">
-              <w:r>
-                <w:rPr>
-                  <w:rFonts w:ascii="Microsoft YaHei UI" w:cs="Microsoft YaHei UI" w:eastAsia="Microsoft YaHei UI" w:hAnsi="Microsoft YaHei UI"/>
-                  <w:color w:val="1B6CA8"/>
-                  <w:sz w:val="18"/>
-                  <w:szCs w:val="18"/>
-                  <w:u w:val="single"/>
-                </w:rPr>
-                <w:t xml:space="preserve">打开原始来源</w:t>
-              </w:r>
-            </w:hyperlink>
-          </w:p>
-        </w:tc>
-        <w:tc>
-          <w:tcPr>
-            <w:tcW w:type="dxa" w:w="3150"/>
-            <w:shd w:fill="FFFFFF" w:val="clear"/>
-            <w:tcMar>
-              <w:top w:type="dxa" w:w="150"/>
-              <w:left w:type="dxa" w:w="170"/>
-              <w:bottom w:type="dxa" w:w="150"/>
-              <w:right w:type="dxa" w:w="170"/>
-            </w:tcMar>
-            <w:vAlign w:val="top"/>
-          </w:tcPr>
-          <w:p>
-            <w:pPr>
-              <w:spacing w:after="80" w:before="0" w:line="340"/>
-            </w:pPr>
-            <w:r>
-              <w:rPr>
-                <w:rFonts w:ascii="Microsoft YaHei UI" w:cs="Microsoft YaHei UI" w:eastAsia="Microsoft YaHei UI" w:hAnsi="Microsoft YaHei UI"/>
-                <w:b/>
-                <w:bCs/>
-                <w:color w:val="0B5C55"/>
-                <w:sz w:val="22"/>
-                <w:szCs w:val="22"/>
-              </w:rPr>
-              <w:t xml:space="preserve">机制竞品；希爱力每日剂量</w:t>
-            </w:r>
-          </w:p>
-          <w:p>
-            <w:pPr>
-              <w:spacing w:after="0" w:before="0" w:line="320"/>
-            </w:pPr>
-            <w:r>
-              <w:rPr>
-                <w:rFonts w:ascii="Microsoft YaHei UI" w:cs="Microsoft YaHei UI" w:eastAsia="Microsoft YaHei UI" w:hAnsi="Microsoft YaHei UI"/>
-                <w:color w:val="152625"/>
-                <w:sz w:val="20"/>
-                <w:szCs w:val="20"/>
-              </w:rPr>
-              <w:t xml:space="preserve">BPH/LUTS 适应症替代；建议查看研究设计、入排标准和终点，判断对可多华或同机制竞品监测的影响。</w:t>
-            </w:r>
-          </w:p>
-        </w:tc>
-      </w:tr>
-      <w:tr>
-        <w:trPr>
-          <w:cantSplit/>
-        </w:trPr>
-        <w:tc>
-          <w:tcPr>
-            <w:tcW w:type="dxa" w:w="1450"/>
-            <w:shd w:fill="F5F8F7" w:val="clear"/>
-            <w:tcMar>
-              <w:top w:type="dxa" w:w="150"/>
-              <w:left w:type="dxa" w:w="170"/>
-              <w:bottom w:type="dxa" w:w="150"/>
-              <w:right w:type="dxa" w:w="170"/>
-            </w:tcMar>
-            <w:vAlign w:val="center"/>
-          </w:tcPr>
-          <w:p>
-            <w:pPr>
-              <w:spacing w:after="60" w:before="0" w:line="340"/>
-            </w:pPr>
-            <w:r>
-              <w:rPr>
-                <w:rFonts w:ascii="Microsoft YaHei UI" w:cs="Microsoft YaHei UI" w:eastAsia="Microsoft YaHei UI" w:hAnsi="Microsoft YaHei UI"/>
-                <w:b/>
-                <w:bCs/>
-                <w:color w:val="152625"/>
-                <w:sz w:val="22"/>
-                <w:szCs w:val="22"/>
-              </w:rPr>
-              <w:t xml:space="preserve">2026-08-07</w:t>
-            </w:r>
-          </w:p>
-          <w:p>
-            <w:pPr>
-              <w:spacing w:after="60" w:before="0" w:line="340"/>
-            </w:pPr>
-            <w:r>
-              <w:rPr>
-                <w:rFonts w:ascii="Microsoft YaHei UI" w:cs="Microsoft YaHei UI" w:eastAsia="Microsoft YaHei UI" w:hAnsi="Microsoft YaHei UI"/>
-                <w:color w:val="5F706E"/>
-                <w:sz w:val="22"/>
-                <w:szCs w:val="22"/>
-              </w:rPr>
-              <w:t xml:space="preserve">Clinical</w:t>
-            </w:r>
-          </w:p>
-          <w:p>
-            <w:pPr>
-              <w:spacing w:after="0" w:before="0" w:line="340"/>
-            </w:pPr>
-            <w:r>
-              <w:rPr>
-                <w:rFonts w:ascii="Microsoft YaHei UI" w:cs="Microsoft YaHei UI" w:eastAsia="Microsoft YaHei UI" w:hAnsi="Microsoft YaHei UI"/>
-                <w:color w:val="0B5C55"/>
-                <w:sz w:val="18"/>
-                <w:szCs w:val="18"/>
-              </w:rPr>
-              <w:t xml:space="preserve">高证据 / 建议跟进</w:t>
-            </w:r>
-          </w:p>
-        </w:tc>
-        <w:tc>
-          <w:tcPr>
-            <w:tcW w:type="dxa" w:w="5400"/>
-            <w:shd w:fill="F5F8F7" w:val="clear"/>
-            <w:tcMar>
-              <w:top w:type="dxa" w:w="150"/>
-              <w:left w:type="dxa" w:w="170"/>
-              <w:bottom w:type="dxa" w:w="150"/>
-              <w:right w:type="dxa" w:w="170"/>
-            </w:tcMar>
-            <w:vAlign w:val="top"/>
-          </w:tcPr>
-          <w:p>
-            <w:pPr>
-              <w:spacing w:after="80" w:before="0" w:line="340"/>
-            </w:pPr>
-            <w:r>
-              <w:rPr>
-                <w:rFonts w:ascii="Microsoft YaHei UI" w:cs="Microsoft YaHei UI" w:eastAsia="Microsoft YaHei UI" w:hAnsi="Microsoft YaHei UI"/>
-                <w:b/>
-                <w:bCs/>
-                <w:color w:val="152625"/>
-                <w:sz w:val="22"/>
-                <w:szCs w:val="22"/>
-              </w:rPr>
-              <w:t xml:space="preserve">每日他达拉非作为辅助疗法与单一疗法治疗 PDE5 抑制剂抵抗性勃起功能障碍</w:t>
-            </w:r>
-          </w:p>
-          <w:p>
-            <w:pPr>
-              <w:spacing w:after="0" w:before="0" w:line="320"/>
-            </w:pPr>
-            <w:r>
-              <w:rPr>
-                <w:rFonts w:ascii="Microsoft YaHei UI" w:cs="Microsoft YaHei UI" w:eastAsia="Microsoft YaHei UI" w:hAnsi="Microsoft YaHei UI"/>
-                <w:color w:val="5F706E"/>
-                <w:sz w:val="20"/>
-                <w:szCs w:val="20"/>
-              </w:rPr>
-              <w:t xml:space="preserve">ClinicalTrials.gov 研究：每日他达拉非作为辅助疗法与单一疗法治疗 PDE5 抑制剂抵抗性勃起功能障碍；NCT：NCT07753720；状态：招募中；阶段：4期；适应症/疾病：勃起功能障碍；他达拉非；首次发布：2026-08-07；最近更新：2026-08-18。</w:t>
-            </w:r>
-          </w:p>
-          <w:p>
-            <w:pPr>
-              <w:spacing w:after="0" w:before="80"/>
-            </w:pPr>
-            <w:hyperlink w:history="1" r:id="rIdzu4efoxsjymrtlbna5sko">
-              <w:r>
-                <w:rPr>
-                  <w:rFonts w:ascii="Microsoft YaHei UI" w:cs="Microsoft YaHei UI" w:eastAsia="Microsoft YaHei UI" w:hAnsi="Microsoft YaHei UI"/>
-                  <w:color w:val="1B6CA8"/>
-                  <w:sz w:val="18"/>
-                  <w:szCs w:val="18"/>
-                  <w:u w:val="single"/>
-                </w:rPr>
-                <w:t xml:space="preserve">打开原始来源</w:t>
-              </w:r>
-            </w:hyperlink>
-          </w:p>
-        </w:tc>
-        <w:tc>
-          <w:tcPr>
-            <w:tcW w:type="dxa" w:w="3150"/>
-            <w:shd w:fill="F5F8F7" w:val="clear"/>
-            <w:tcMar>
-              <w:top w:type="dxa" w:w="150"/>
-              <w:left w:type="dxa" w:w="170"/>
-              <w:bottom w:type="dxa" w:w="150"/>
-              <w:right w:type="dxa" w:w="170"/>
-            </w:tcMar>
-            <w:vAlign w:val="top"/>
-          </w:tcPr>
-          <w:p>
-            <w:pPr>
-              <w:spacing w:after="80" w:before="0" w:line="340"/>
-            </w:pPr>
-            <w:r>
-              <w:rPr>
-                <w:rFonts w:ascii="Microsoft YaHei UI" w:cs="Microsoft YaHei UI" w:eastAsia="Microsoft YaHei UI" w:hAnsi="Microsoft YaHei UI"/>
-                <w:b/>
-                <w:bCs/>
-                <w:color w:val="0B5C55"/>
-                <w:sz w:val="22"/>
-                <w:szCs w:val="22"/>
-              </w:rPr>
-              <w:t xml:space="preserve">机制竞品；希爱力每日剂量</w:t>
-            </w:r>
-          </w:p>
-          <w:p>
-            <w:pPr>
-              <w:spacing w:after="0" w:before="0" w:line="320"/>
-            </w:pPr>
-            <w:r>
-              <w:rPr>
-                <w:rFonts w:ascii="Microsoft YaHei UI" w:cs="Microsoft YaHei UI" w:eastAsia="Microsoft YaHei UI" w:hAnsi="Microsoft YaHei UI"/>
-                <w:color w:val="152625"/>
-                <w:sz w:val="20"/>
-                <w:szCs w:val="20"/>
-              </w:rPr>
-              <w:t xml:space="preserve">BPH/LUTS 适应症替代；建议查看研究设计、入排标准和终点，判断对可多华或同机制竞品监测的影响。</w:t>
-            </w:r>
-          </w:p>
-        </w:tc>
-      </w:tr>
-      <w:tr>
-        <w:trPr>
-          <w:cantSplit/>
-        </w:trPr>
-        <w:tc>
-          <w:tcPr>
-            <w:tcW w:type="dxa" w:w="1450"/>
-            <w:shd w:fill="FFFFFF" w:val="clear"/>
-            <w:tcMar>
-              <w:top w:type="dxa" w:w="150"/>
-              <w:left w:type="dxa" w:w="170"/>
-              <w:bottom w:type="dxa" w:w="150"/>
-              <w:right w:type="dxa" w:w="170"/>
-            </w:tcMar>
-            <w:vAlign w:val="center"/>
-          </w:tcPr>
-          <w:p>
-            <w:pPr>
-              <w:spacing w:after="60" w:before="0" w:line="340"/>
-            </w:pPr>
-            <w:r>
-              <w:rPr>
-                <w:rFonts w:ascii="Microsoft YaHei UI" w:cs="Microsoft YaHei UI" w:eastAsia="Microsoft YaHei UI" w:hAnsi="Microsoft YaHei UI"/>
-                <w:b/>
-                <w:bCs/>
-                <w:color w:val="152625"/>
-                <w:sz w:val="22"/>
-                <w:szCs w:val="22"/>
-              </w:rPr>
-              <w:t xml:space="preserve">2026-08-03</w:t>
-            </w:r>
-          </w:p>
-          <w:p>
-            <w:pPr>
-              <w:spacing w:after="60" w:before="0" w:line="340"/>
-            </w:pPr>
-            <w:r>
-              <w:rPr>
-                <w:rFonts w:ascii="Microsoft YaHei UI" w:cs="Microsoft YaHei UI" w:eastAsia="Microsoft YaHei UI" w:hAnsi="Microsoft YaHei UI"/>
-                <w:color w:val="5F706E"/>
-                <w:sz w:val="22"/>
-                <w:szCs w:val="22"/>
-              </w:rPr>
-              <w:t xml:space="preserve">Clinical</w:t>
-            </w:r>
-          </w:p>
-          <w:p>
-            <w:pPr>
-              <w:spacing w:after="0" w:before="0" w:line="340"/>
-            </w:pPr>
-            <w:r>
-              <w:rPr>
-                <w:rFonts w:ascii="Microsoft YaHei UI" w:cs="Microsoft YaHei UI" w:eastAsia="Microsoft YaHei UI" w:hAnsi="Microsoft YaHei UI"/>
-                <w:color w:val="0B5C55"/>
-                <w:sz w:val="18"/>
-                <w:szCs w:val="18"/>
-              </w:rPr>
-              <w:t xml:space="preserve">高证据 / 建议跟进</w:t>
-            </w:r>
-          </w:p>
-        </w:tc>
-        <w:tc>
-          <w:tcPr>
-            <w:tcW w:type="dxa" w:w="5400"/>
-            <w:shd w:fill="FFFFFF" w:val="clear"/>
-            <w:tcMar>
-              <w:top w:type="dxa" w:w="150"/>
-              <w:left w:type="dxa" w:w="170"/>
-              <w:bottom w:type="dxa" w:w="150"/>
-              <w:right w:type="dxa" w:w="170"/>
-            </w:tcMar>
-            <w:vAlign w:val="top"/>
-          </w:tcPr>
-          <w:p>
-            <w:pPr>
-              <w:spacing w:after="80" w:before="0" w:line="340"/>
-            </w:pPr>
-            <w:r>
-              <w:rPr>
-                <w:rFonts w:ascii="Microsoft YaHei UI" w:cs="Microsoft YaHei UI" w:eastAsia="Microsoft YaHei UI" w:hAnsi="Microsoft YaHei UI"/>
-                <w:b/>
-                <w:bCs/>
-                <w:color w:val="152625"/>
-                <w:sz w:val="22"/>
-                <w:szCs w:val="22"/>
-              </w:rPr>
-              <w:t xml:space="preserve">脊髓损伤后联合或不联合非那雄胺的睾酮治疗：TRT-SCI 试验</w:t>
-            </w:r>
-          </w:p>
-          <w:p>
-            <w:pPr>
-              <w:spacing w:after="0" w:before="0" w:line="320"/>
-            </w:pPr>
-            <w:r>
-              <w:rPr>
-                <w:rFonts w:ascii="Microsoft YaHei UI" w:cs="Microsoft YaHei UI" w:eastAsia="Microsoft YaHei UI" w:hAnsi="Microsoft YaHei UI"/>
-                <w:color w:val="5F706E"/>
-                <w:sz w:val="20"/>
-                <w:szCs w:val="20"/>
-              </w:rPr>
-              <w:t xml:space="preserve">ClinicalTrials.gov 研究：脊髓损伤后联合或不联合非那雄胺的睾酮治疗：TRT-SCI 试验；NCT：NCT07742553；状态：尚未招募；阶段：2期；3期；适应症/疾病：脊髓损伤；脊髓损伤；损伤，脊髓；脊髓挫伤；脊髓外伤；外伤，神经系统；伤口和损伤；脊髓压迫；神经系统疾病；脊髓疾病；性腺疾病；内分泌系统疾病；性腺功能减退症；生殖器疾病，男性；首次发布：2026-08-03；最近更新：2026-08-04。</w:t>
-            </w:r>
-          </w:p>
-          <w:p>
-            <w:pPr>
-              <w:spacing w:after="0" w:before="80"/>
-            </w:pPr>
-            <w:hyperlink w:history="1" r:id="rIdlxbonj8ruipif9one7e9c">
-              <w:r>
-                <w:rPr>
-                  <w:rFonts w:ascii="Microsoft YaHei UI" w:cs="Microsoft YaHei UI" w:eastAsia="Microsoft YaHei UI" w:hAnsi="Microsoft YaHei UI"/>
-                  <w:color w:val="1B6CA8"/>
-                  <w:sz w:val="18"/>
-                  <w:szCs w:val="18"/>
-                  <w:u w:val="single"/>
-                </w:rPr>
-                <w:t xml:space="preserve">打开原始来源</w:t>
-              </w:r>
-            </w:hyperlink>
-          </w:p>
-        </w:tc>
-        <w:tc>
-          <w:tcPr>
-            <w:tcW w:type="dxa" w:w="3150"/>
-            <w:shd w:fill="FFFFFF" w:val="clear"/>
-            <w:tcMar>
-              <w:top w:type="dxa" w:w="150"/>
-              <w:left w:type="dxa" w:w="170"/>
-              <w:bottom w:type="dxa" w:w="150"/>
-              <w:right w:type="dxa" w:w="170"/>
-            </w:tcMar>
-            <w:vAlign w:val="top"/>
-          </w:tcPr>
-          <w:p>
-            <w:pPr>
-              <w:spacing w:after="80" w:before="0" w:line="340"/>
-            </w:pPr>
-            <w:r>
-              <w:rPr>
-                <w:rFonts w:ascii="Microsoft YaHei UI" w:cs="Microsoft YaHei UI" w:eastAsia="Microsoft YaHei UI" w:hAnsi="Microsoft YaHei UI"/>
-                <w:b/>
-                <w:bCs/>
-                <w:color w:val="0B5C55"/>
-                <w:sz w:val="22"/>
-                <w:szCs w:val="22"/>
-              </w:rPr>
-              <w:t xml:space="preserve">机制竞品；保法止/Proscar</w:t>
-            </w:r>
-          </w:p>
-          <w:p>
-            <w:pPr>
-              <w:spacing w:after="0" w:before="0" w:line="320"/>
-            </w:pPr>
-            <w:r>
-              <w:rPr>
-                <w:rFonts w:ascii="Microsoft YaHei UI" w:cs="Microsoft YaHei UI" w:eastAsia="Microsoft YaHei UI" w:hAnsi="Microsoft YaHei UI"/>
-                <w:color w:val="152625"/>
-                <w:sz w:val="20"/>
-                <w:szCs w:val="20"/>
-              </w:rPr>
-              <w:t xml:space="preserve">BPH 长期疾病进展管理；建议查看研究设计、入排标准和终点，判断对可多华或同机制竞品监测的影响。</w:t>
-            </w:r>
-          </w:p>
-        </w:tc>
-      </w:tr>
-      <w:tr>
-        <w:trPr>
-          <w:cantSplit/>
-        </w:trPr>
-        <w:tc>
-          <w:tcPr>
-            <w:tcW w:type="dxa" w:w="1450"/>
-            <w:shd w:fill="F5F8F7" w:val="clear"/>
-            <w:tcMar>
-              <w:top w:type="dxa" w:w="150"/>
-              <w:left w:type="dxa" w:w="170"/>
-              <w:bottom w:type="dxa" w:w="150"/>
-              <w:right w:type="dxa" w:w="170"/>
-            </w:tcMar>
-            <w:vAlign w:val="center"/>
-          </w:tcPr>
-          <w:p>
-            <w:pPr>
-              <w:spacing w:after="60" w:before="0" w:line="340"/>
-            </w:pPr>
-            <w:r>
-              <w:rPr>
-                <w:rFonts w:ascii="Microsoft YaHei UI" w:cs="Microsoft YaHei UI" w:eastAsia="Microsoft YaHei UI" w:hAnsi="Microsoft YaHei UI"/>
-                <w:b/>
-                <w:bCs/>
-                <w:color w:val="152625"/>
-                <w:sz w:val="22"/>
-                <w:szCs w:val="22"/>
-              </w:rPr>
-              <w:t xml:space="preserve">2026-08-21</w:t>
-            </w:r>
-          </w:p>
-          <w:p>
-            <w:pPr>
-              <w:spacing w:after="60" w:before="0" w:line="340"/>
-            </w:pPr>
-            <w:r>
-              <w:rPr>
-                <w:rFonts w:ascii="Microsoft YaHei UI" w:cs="Microsoft YaHei UI" w:eastAsia="Microsoft YaHei UI" w:hAnsi="Microsoft YaHei UI"/>
-                <w:color w:val="5F706E"/>
-                <w:sz w:val="22"/>
-                <w:szCs w:val="22"/>
-              </w:rPr>
-              <w:t xml:space="preserve">Clinical</w:t>
-            </w:r>
-          </w:p>
-          <w:p>
-            <w:pPr>
-              <w:spacing w:after="0" w:before="0" w:line="340"/>
-            </w:pPr>
-            <w:r>
-              <w:rPr>
-                <w:rFonts w:ascii="Microsoft YaHei UI" w:cs="Microsoft YaHei UI" w:eastAsia="Microsoft YaHei UI" w:hAnsi="Microsoft YaHei UI"/>
-                <w:color w:val="0B5C55"/>
-                <w:sz w:val="18"/>
-                <w:szCs w:val="18"/>
-              </w:rPr>
-              <w:t xml:space="preserve">高证据 / 建议跟进</w:t>
-            </w:r>
-          </w:p>
-        </w:tc>
-        <w:tc>
-          <w:tcPr>
-            <w:tcW w:type="dxa" w:w="5400"/>
-            <w:shd w:fill="F5F8F7" w:val="clear"/>
-            <w:tcMar>
-              <w:top w:type="dxa" w:w="150"/>
-              <w:left w:type="dxa" w:w="170"/>
-              <w:bottom w:type="dxa" w:w="150"/>
-              <w:right w:type="dxa" w:w="170"/>
-            </w:tcMar>
-            <w:vAlign w:val="top"/>
-          </w:tcPr>
-          <w:p>
-            <w:pPr>
-              <w:spacing w:after="80" w:before="0" w:line="340"/>
-            </w:pPr>
-            <w:r>
-              <w:rPr>
-                <w:rFonts w:ascii="Microsoft YaHei UI" w:cs="Microsoft YaHei UI" w:eastAsia="Microsoft YaHei UI" w:hAnsi="Microsoft YaHei UI"/>
-                <w:b/>
-                <w:bCs/>
-                <w:color w:val="152625"/>
-                <w:sz w:val="22"/>
-                <w:szCs w:val="22"/>
-              </w:rPr>
-              <w:t xml:space="preserve">西洛多辛治疗良性前列腺增生的疗效和安全性</w:t>
-            </w:r>
-          </w:p>
-          <w:p>
-            <w:pPr>
-              <w:spacing w:after="0" w:before="0" w:line="320"/>
-            </w:pPr>
-            <w:r>
-              <w:rPr>
-                <w:rFonts w:ascii="Microsoft YaHei UI" w:cs="Microsoft YaHei UI" w:eastAsia="Microsoft YaHei UI" w:hAnsi="Microsoft YaHei UI"/>
-                <w:color w:val="5F706E"/>
-                <w:sz w:val="20"/>
-                <w:szCs w:val="20"/>
-              </w:rPr>
-              <w:t xml:space="preserve">ClinicalTrials.gov 研究：西洛多辛治疗良性前列腺增生的疗效和安全性；NCT：NCT05551221；状态：已完成；阶段：4期；适应症/疾病：良性前列腺增生伴下尿路症状；首次发布：2022-09-22；最近更新：2026-08-21。</w:t>
-            </w:r>
-          </w:p>
-          <w:p>
-            <w:pPr>
-              <w:spacing w:after="0" w:before="80"/>
-            </w:pPr>
-            <w:hyperlink w:history="1" r:id="rIds5qdsb8_8gdftcpr_anf2">
-              <w:r>
-                <w:rPr>
-                  <w:rFonts w:ascii="Microsoft YaHei UI" w:cs="Microsoft YaHei UI" w:eastAsia="Microsoft YaHei UI" w:hAnsi="Microsoft YaHei UI"/>
-                  <w:color w:val="1B6CA8"/>
-                  <w:sz w:val="18"/>
-                  <w:szCs w:val="18"/>
-                  <w:u w:val="single"/>
-                </w:rPr>
-                <w:t xml:space="preserve">打开原始来源</w:t>
-              </w:r>
-            </w:hyperlink>
-          </w:p>
-        </w:tc>
-        <w:tc>
-          <w:tcPr>
-            <w:tcW w:type="dxa" w:w="3150"/>
-            <w:shd w:fill="F5F8F7" w:val="clear"/>
-            <w:tcMar>
-              <w:top w:type="dxa" w:w="150"/>
-              <w:left w:type="dxa" w:w="170"/>
-              <w:bottom w:type="dxa" w:w="150"/>
-              <w:right w:type="dxa" w:w="170"/>
-            </w:tcMar>
-            <w:vAlign w:val="top"/>
-          </w:tcPr>
-          <w:p>
-            <w:pPr>
-              <w:spacing w:after="80" w:before="0" w:line="340"/>
-            </w:pPr>
-            <w:r>
-              <w:rPr>
-                <w:rFonts w:ascii="Microsoft YaHei UI" w:cs="Microsoft YaHei UI" w:eastAsia="Microsoft YaHei UI" w:hAnsi="Microsoft YaHei UI"/>
-                <w:b/>
-                <w:bCs/>
-                <w:color w:val="0B5C55"/>
-                <w:sz w:val="22"/>
-                <w:szCs w:val="22"/>
-              </w:rPr>
-              <w:t xml:space="preserve">直接竞品；哈乐/Flomax</w:t>
-            </w:r>
-          </w:p>
-          <w:p>
-            <w:pPr>
-              <w:spacing w:after="0" w:before="0" w:line="320"/>
-            </w:pPr>
-            <w:r>
-              <w:rPr>
-                <w:rFonts w:ascii="Microsoft YaHei UI" w:cs="Microsoft YaHei UI" w:eastAsia="Microsoft YaHei UI" w:hAnsi="Microsoft YaHei UI"/>
-                <w:color w:val="152625"/>
-                <w:sz w:val="20"/>
-                <w:szCs w:val="20"/>
-              </w:rPr>
-              <w:t xml:space="preserve">BPH 一线替代；建议查看研究设计、入排标准和终点，判断对可多华或同机制竞品监测的影响。</w:t>
-            </w:r>
-          </w:p>
-        </w:tc>
-      </w:tr>
-      <w:tr>
-        <w:trPr>
-          <w:cantSplit/>
-        </w:trPr>
-        <w:tc>
-          <w:tcPr>
-            <w:tcW w:type="dxa" w:w="1450"/>
-            <w:shd w:fill="FFFFFF" w:val="clear"/>
-            <w:tcMar>
-              <w:top w:type="dxa" w:w="150"/>
-              <w:left w:type="dxa" w:w="170"/>
-              <w:bottom w:type="dxa" w:w="150"/>
-              <w:right w:type="dxa" w:w="170"/>
-            </w:tcMar>
-            <w:vAlign w:val="center"/>
-          </w:tcPr>
-          <w:p>
-            <w:pPr>
-              <w:spacing w:after="60" w:before="0" w:line="340"/>
-            </w:pPr>
-            <w:r>
-              <w:rPr>
-                <w:rFonts w:ascii="Microsoft YaHei UI" w:cs="Microsoft YaHei UI" w:eastAsia="Microsoft YaHei UI" w:hAnsi="Microsoft YaHei UI"/>
-                <w:b/>
-                <w:bCs/>
-                <w:color w:val="152625"/>
-                <w:sz w:val="22"/>
-                <w:szCs w:val="22"/>
-              </w:rPr>
-              <w:t xml:space="preserve">2026-08-31</w:t>
-            </w:r>
-          </w:p>
-          <w:p>
-            <w:pPr>
-              <w:spacing w:after="60" w:before="0" w:line="340"/>
-            </w:pPr>
-            <w:r>
-              <w:rPr>
-                <w:rFonts w:ascii="Microsoft YaHei UI" w:cs="Microsoft YaHei UI" w:eastAsia="Microsoft YaHei UI" w:hAnsi="Microsoft YaHei UI"/>
-                <w:color w:val="5F706E"/>
-                <w:sz w:val="22"/>
-                <w:szCs w:val="22"/>
-              </w:rPr>
-              <w:t xml:space="preserve">Clinical</w:t>
-            </w:r>
-          </w:p>
-          <w:p>
-            <w:pPr>
-              <w:spacing w:after="0" w:before="0" w:line="340"/>
-            </w:pPr>
-            <w:r>
-              <w:rPr>
-                <w:rFonts w:ascii="Microsoft YaHei UI" w:cs="Microsoft YaHei UI" w:eastAsia="Microsoft YaHei UI" w:hAnsi="Microsoft YaHei UI"/>
-                <w:color w:val="0B5C55"/>
-                <w:sz w:val="18"/>
-                <w:szCs w:val="18"/>
-              </w:rPr>
-              <w:t xml:space="preserve">高证据 / 建议跟进</w:t>
-            </w:r>
-          </w:p>
-        </w:tc>
-        <w:tc>
-          <w:tcPr>
-            <w:tcW w:type="dxa" w:w="5400"/>
-            <w:shd w:fill="FFFFFF" w:val="clear"/>
-            <w:tcMar>
-              <w:top w:type="dxa" w:w="150"/>
-              <w:left w:type="dxa" w:w="170"/>
-              <w:bottom w:type="dxa" w:w="150"/>
-              <w:right w:type="dxa" w:w="170"/>
-            </w:tcMar>
-            <w:vAlign w:val="top"/>
-          </w:tcPr>
-          <w:p>
-            <w:pPr>
-              <w:spacing w:after="80" w:before="0" w:line="340"/>
-            </w:pPr>
-            <w:r>
-              <w:rPr>
-                <w:rFonts w:ascii="Microsoft YaHei UI" w:cs="Microsoft YaHei UI" w:eastAsia="Microsoft YaHei UI" w:hAnsi="Microsoft YaHei UI"/>
-                <w:b/>
-                <w:bCs/>
-                <w:color w:val="152625"/>
-                <w:sz w:val="22"/>
-                <w:szCs w:val="22"/>
-              </w:rPr>
-              <w:t xml:space="preserve">米拉贝隆和他达拉非对糖尿病前期患者葡萄糖耐量的影响</w:t>
-            </w:r>
-          </w:p>
-          <w:p>
-            <w:pPr>
-              <w:spacing w:after="0" w:before="0" w:line="320"/>
-            </w:pPr>
-            <w:r>
-              <w:rPr>
-                <w:rFonts w:ascii="Microsoft YaHei UI" w:cs="Microsoft YaHei UI" w:eastAsia="Microsoft YaHei UI" w:hAnsi="Microsoft YaHei UI"/>
-                <w:color w:val="5F706E"/>
-                <w:sz w:val="20"/>
-                <w:szCs w:val="20"/>
-              </w:rPr>
-              <w:t xml:space="preserve">ClinicalTrials.gov 研究：米拉贝隆和他达拉非对糖尿病前期患者葡萄糖耐量的影响；NCT：NCT05051436；状态：招募中；阶段：4期；适应症/疾病：Pre-diabetes；Obesity；首次发布：2021-09-21；最近更新：2026-08-31。</w:t>
-            </w:r>
-          </w:p>
-          <w:p>
-            <w:pPr>
-              <w:spacing w:after="0" w:before="80"/>
-            </w:pPr>
-            <w:hyperlink w:history="1" r:id="rIdjbuw8my8_gtk-hjt6mila">
-              <w:r>
-                <w:rPr>
-                  <w:rFonts w:ascii="Microsoft YaHei UI" w:cs="Microsoft YaHei UI" w:eastAsia="Microsoft YaHei UI" w:hAnsi="Microsoft YaHei UI"/>
-                  <w:color w:val="1B6CA8"/>
-                  <w:sz w:val="18"/>
-                  <w:szCs w:val="18"/>
-                  <w:u w:val="single"/>
-                </w:rPr>
-                <w:t xml:space="preserve">打开原始来源</w:t>
-              </w:r>
-            </w:hyperlink>
-          </w:p>
-        </w:tc>
-        <w:tc>
-          <w:tcPr>
-            <w:tcW w:type="dxa" w:w="3150"/>
-            <w:shd w:fill="FFFFFF" w:val="clear"/>
-            <w:tcMar>
-              <w:top w:type="dxa" w:w="150"/>
-              <w:left w:type="dxa" w:w="170"/>
-              <w:bottom w:type="dxa" w:w="150"/>
-              <w:right w:type="dxa" w:w="170"/>
-            </w:tcMar>
-            <w:vAlign w:val="top"/>
-          </w:tcPr>
-          <w:p>
-            <w:pPr>
-              <w:spacing w:after="80" w:before="0" w:line="340"/>
-            </w:pPr>
-            <w:r>
-              <w:rPr>
-                <w:rFonts w:ascii="Microsoft YaHei UI" w:cs="Microsoft YaHei UI" w:eastAsia="Microsoft YaHei UI" w:hAnsi="Microsoft YaHei UI"/>
-                <w:b/>
-                <w:bCs/>
-                <w:color w:val="0B5C55"/>
-                <w:sz w:val="22"/>
-                <w:szCs w:val="22"/>
-              </w:rPr>
-              <w:t xml:space="preserve">机制竞品；希爱力每日剂量</w:t>
-            </w:r>
-          </w:p>
-          <w:p>
-            <w:pPr>
-              <w:spacing w:after="0" w:before="0" w:line="320"/>
-            </w:pPr>
-            <w:r>
-              <w:rPr>
-                <w:rFonts w:ascii="Microsoft YaHei UI" w:cs="Microsoft YaHei UI" w:eastAsia="Microsoft YaHei UI" w:hAnsi="Microsoft YaHei UI"/>
-                <w:color w:val="152625"/>
-                <w:sz w:val="20"/>
-                <w:szCs w:val="20"/>
-              </w:rPr>
-              <w:t xml:space="preserve">BPH/LUTS 适应症替代；建议查看研究设计、入排标准和终点，判断对可多华或同机制竞品监测的影响。</w:t>
-            </w:r>
-          </w:p>
-        </w:tc>
-      </w:tr>
-      <w:tr>
-        <w:trPr>
-          <w:cantSplit/>
-        </w:trPr>
-        <w:tc>
-          <w:tcPr>
-            <w:tcW w:type="dxa" w:w="1450"/>
-            <w:shd w:fill="F5F8F7" w:val="clear"/>
-            <w:tcMar>
-              <w:top w:type="dxa" w:w="150"/>
-              <w:left w:type="dxa" w:w="170"/>
-              <w:bottom w:type="dxa" w:w="150"/>
-              <w:right w:type="dxa" w:w="170"/>
-            </w:tcMar>
-            <w:vAlign w:val="center"/>
-          </w:tcPr>
-          <w:p>
-            <w:pPr>
-              <w:spacing w:after="60" w:before="0" w:line="340"/>
-            </w:pPr>
-            <w:r>
-              <w:rPr>
-                <w:rFonts w:ascii="Microsoft YaHei UI" w:cs="Microsoft YaHei UI" w:eastAsia="Microsoft YaHei UI" w:hAnsi="Microsoft YaHei UI"/>
-                <w:b/>
-                <w:bCs/>
-                <w:color w:val="152625"/>
-                <w:sz w:val="22"/>
-                <w:szCs w:val="22"/>
-              </w:rPr>
-              <w:t xml:space="preserve">2026-08-29</w:t>
-            </w:r>
-          </w:p>
-          <w:p>
-            <w:pPr>
-              <w:spacing w:after="60" w:before="0" w:line="340"/>
-            </w:pPr>
-            <w:r>
-              <w:rPr>
-                <w:rFonts w:ascii="Microsoft YaHei UI" w:cs="Microsoft YaHei UI" w:eastAsia="Microsoft YaHei UI" w:hAnsi="Microsoft YaHei UI"/>
-                <w:color w:val="5F706E"/>
-                <w:sz w:val="22"/>
-                <w:szCs w:val="22"/>
-              </w:rPr>
-              <w:t xml:space="preserve">PubMed</w:t>
-            </w:r>
-          </w:p>
-          <w:p>
-            <w:pPr>
-              <w:spacing w:after="0" w:before="0" w:line="340"/>
-            </w:pPr>
-            <w:r>
-              <w:rPr>
-                <w:rFonts w:ascii="Microsoft YaHei UI" w:cs="Microsoft YaHei UI" w:eastAsia="Microsoft YaHei UI" w:hAnsi="Microsoft YaHei UI"/>
-                <w:color w:val="0B5C55"/>
-                <w:sz w:val="18"/>
-                <w:szCs w:val="18"/>
-              </w:rPr>
-              <w:t xml:space="preserve">高证据 / 建议跟进</w:t>
-            </w:r>
-          </w:p>
-        </w:tc>
-        <w:tc>
-          <w:tcPr>
-            <w:tcW w:type="dxa" w:w="5400"/>
-            <w:shd w:fill="F5F8F7" w:val="clear"/>
-            <w:tcMar>
-              <w:top w:type="dxa" w:w="150"/>
-              <w:left w:type="dxa" w:w="170"/>
-              <w:bottom w:type="dxa" w:w="150"/>
-              <w:right w:type="dxa" w:w="170"/>
-            </w:tcMar>
-            <w:vAlign w:val="top"/>
-          </w:tcPr>
-          <w:p>
-            <w:pPr>
-              <w:spacing w:after="80" w:before="0" w:line="340"/>
-            </w:pPr>
-            <w:r>
-              <w:rPr>
-                <w:rFonts w:ascii="Microsoft YaHei UI" w:cs="Microsoft YaHei UI" w:eastAsia="Microsoft YaHei UI" w:hAnsi="Microsoft YaHei UI"/>
-                <w:b/>
-                <w:bCs/>
-                <w:color w:val="152625"/>
-                <w:sz w:val="22"/>
-                <w:szCs w:val="22"/>
-              </w:rPr>
-              <w:t xml:space="preserve">坦索罗辛与坦索罗辛加托特罗定治疗远端输尿管结石的比较。</w:t>
-            </w:r>
-          </w:p>
-          <w:p>
-            <w:pPr>
-              <w:spacing w:after="0" w:before="0" w:line="320"/>
-            </w:pPr>
-            <w:r>
-              <w:rPr>
-                <w:rFonts w:ascii="Microsoft YaHei UI" w:cs="Microsoft YaHei UI" w:eastAsia="Microsoft YaHei UI" w:hAnsi="Microsoft YaHei UI"/>
-                <w:color w:val="5F706E"/>
-                <w:sz w:val="20"/>
-                <w:szCs w:val="20"/>
-              </w:rPr>
-              <w:t xml:space="preserve">原题：坦索罗辛与坦索罗辛加托特罗定治疗远端输尿管结石的比较。；期刊：World J Urol；检索词：tamsulosin；出版时间：2026-08-29。</w:t>
-            </w:r>
-          </w:p>
-          <w:p>
-            <w:pPr>
-              <w:spacing w:after="0" w:before="80"/>
-            </w:pPr>
-            <w:hyperlink w:history="1" r:id="rIdkayxrlybsbdhcntoe3__k">
-              <w:r>
-                <w:rPr>
-                  <w:rFonts w:ascii="Microsoft YaHei UI" w:cs="Microsoft YaHei UI" w:eastAsia="Microsoft YaHei UI" w:hAnsi="Microsoft YaHei UI"/>
-                  <w:color w:val="1B6CA8"/>
-                  <w:sz w:val="18"/>
-                  <w:szCs w:val="18"/>
-                  <w:u w:val="single"/>
-                </w:rPr>
-                <w:t xml:space="preserve">打开原始来源</w:t>
-              </w:r>
-            </w:hyperlink>
-          </w:p>
-        </w:tc>
-        <w:tc>
-          <w:tcPr>
-            <w:tcW w:type="dxa" w:w="3150"/>
-            <w:shd w:fill="F5F8F7" w:val="clear"/>
-            <w:tcMar>
-              <w:top w:type="dxa" w:w="150"/>
-              <w:left w:type="dxa" w:w="170"/>
-              <w:bottom w:type="dxa" w:w="150"/>
-              <w:right w:type="dxa" w:w="170"/>
-            </w:tcMar>
-            <w:vAlign w:val="top"/>
-          </w:tcPr>
-          <w:p>
-            <w:pPr>
-              <w:spacing w:after="80" w:before="0" w:line="340"/>
-            </w:pPr>
-            <w:r>
-              <w:rPr>
-                <w:rFonts w:ascii="Microsoft YaHei UI" w:cs="Microsoft YaHei UI" w:eastAsia="Microsoft YaHei UI" w:hAnsi="Microsoft YaHei UI"/>
-                <w:b/>
-                <w:bCs/>
-                <w:color w:val="0B5C55"/>
-                <w:sz w:val="22"/>
-                <w:szCs w:val="22"/>
-              </w:rPr>
-              <w:t xml:space="preserve">直接竞品；哈乐/Flomax</w:t>
-            </w:r>
-          </w:p>
-          <w:p>
-            <w:pPr>
-              <w:spacing w:after="0" w:before="0" w:line="320"/>
-            </w:pPr>
-            <w:r>
-              <w:rPr>
-                <w:rFonts w:ascii="Microsoft YaHei UI" w:cs="Microsoft YaHei UI" w:eastAsia="Microsoft YaHei UI" w:hAnsi="Microsoft YaHei UI"/>
-                <w:color w:val="152625"/>
-                <w:sz w:val="20"/>
-                <w:szCs w:val="20"/>
-              </w:rPr>
-              <w:t xml:space="preserve">BPH 一线替代；建议评估该更新对可多华相关医学信息、竞品监测或风险沟通的影响。</w:t>
+              <w:t xml:space="preserve">该文涉及盐酸坦索罗辛及可多华的直接竞品追踪路径；应依据原文研究人群、终点与研究设计判断临床适用性，不把题名当作疗效结论。</w:t>
             </w:r>
           </w:p>
         </w:tc>
@@ -2126,159 +1136,7 @@
           <w:sz w:val="21"/>
           <w:szCs w:val="21"/>
         </w:rPr>
-        <w:t xml:space="preserve">他达拉非 / tadalafil / C22H19N3O4（18 条）</w:t>
-      </w:r>
-    </w:p>
-    <w:p>
-      <w:pPr>
-        <w:pStyle w:val="ListParagraph"/>
-        <w:numPr>
-          <w:ilvl w:val="0"/>
-          <w:numId w:val="1"/>
-        </w:numPr>
-        <w:spacing w:after="80" w:before="0" w:line="340"/>
-      </w:pPr>
-      <w:r>
-        <w:rPr>
-          <w:rFonts w:ascii="Microsoft YaHei UI" w:cs="Microsoft YaHei UI" w:eastAsia="Microsoft YaHei UI" w:hAnsi="Microsoft YaHei UI"/>
-          <w:color w:val="152625"/>
-          <w:sz w:val="21"/>
-          <w:szCs w:val="21"/>
-        </w:rPr>
-        <w:t xml:space="preserve">盐酸坦索罗辛 / tamsulosin hydrochloride / C20H29ClN2O5S（7 条）</w:t>
-      </w:r>
-    </w:p>
-    <w:p>
-      <w:pPr>
-        <w:pStyle w:val="ListParagraph"/>
-        <w:numPr>
-          <w:ilvl w:val="0"/>
-          <w:numId w:val="1"/>
-        </w:numPr>
-        <w:spacing w:after="80" w:before="0" w:line="340"/>
-      </w:pPr>
-      <w:r>
-        <w:rPr>
-          <w:rFonts w:ascii="Microsoft YaHei UI" w:cs="Microsoft YaHei UI" w:eastAsia="Microsoft YaHei UI" w:hAnsi="Microsoft YaHei UI"/>
-          <w:color w:val="152625"/>
-          <w:sz w:val="21"/>
-          <w:szCs w:val="21"/>
-        </w:rPr>
-        <w:t xml:space="preserve">非那雄胺 / finasteride / C23H36N2O2（7 条）</w:t>
-      </w:r>
-    </w:p>
-    <w:p>
-      <w:pPr>
-        <w:pStyle w:val="ListParagraph"/>
-        <w:numPr>
-          <w:ilvl w:val="0"/>
-          <w:numId w:val="1"/>
-        </w:numPr>
-        <w:spacing w:after="80" w:before="0" w:line="340"/>
-      </w:pPr>
-      <w:r>
-        <w:rPr>
-          <w:rFonts w:ascii="Microsoft YaHei UI" w:cs="Microsoft YaHei UI" w:eastAsia="Microsoft YaHei UI" w:hAnsi="Microsoft YaHei UI"/>
-          <w:color w:val="152625"/>
-          <w:sz w:val="21"/>
-          <w:szCs w:val="21"/>
-        </w:rPr>
-        <w:t xml:space="preserve">度他雄胺 / dutasteride / C27H30F6N2O2（4 条）</w:t>
-      </w:r>
-    </w:p>
-    <w:p>
-      <w:pPr>
-        <w:pStyle w:val="ListParagraph"/>
-        <w:numPr>
-          <w:ilvl w:val="0"/>
-          <w:numId w:val="1"/>
-        </w:numPr>
-        <w:spacing w:after="80" w:before="0" w:line="340"/>
-      </w:pPr>
-      <w:r>
-        <w:rPr>
-          <w:rFonts w:ascii="Microsoft YaHei UI" w:cs="Microsoft YaHei UI" w:eastAsia="Microsoft YaHei UI" w:hAnsi="Microsoft YaHei UI"/>
-          <w:color w:val="152625"/>
-          <w:sz w:val="21"/>
-          <w:szCs w:val="21"/>
-        </w:rPr>
-        <w:t xml:space="preserve">盐酸哌唑嗪 / prazosin hydrochloride / C19H22ClN5O4（3 条）</w:t>
-      </w:r>
-    </w:p>
-    <w:p>
-      <w:pPr>
-        <w:pStyle w:val="ListParagraph"/>
-        <w:numPr>
-          <w:ilvl w:val="0"/>
-          <w:numId w:val="1"/>
-        </w:numPr>
-        <w:spacing w:after="80" w:before="0" w:line="340"/>
-      </w:pPr>
-      <w:r>
-        <w:rPr>
-          <w:rFonts w:ascii="Microsoft YaHei UI" w:cs="Microsoft YaHei UI" w:eastAsia="Microsoft YaHei UI" w:hAnsi="Microsoft YaHei UI"/>
-          <w:color w:val="152625"/>
-          <w:sz w:val="21"/>
-          <w:szCs w:val="21"/>
-        </w:rPr>
-        <w:t xml:space="preserve">赛洛多辛 / silodosin / C25H32F3N3O4（3 条）</w:t>
-      </w:r>
-    </w:p>
-    <w:p>
-      <w:pPr>
-        <w:pStyle w:val="ListParagraph"/>
-        <w:numPr>
-          <w:ilvl w:val="0"/>
-          <w:numId w:val="1"/>
-        </w:numPr>
-        <w:spacing w:after="80" w:before="0" w:line="340"/>
-      </w:pPr>
-      <w:r>
-        <w:rPr>
-          <w:rFonts w:ascii="Microsoft YaHei UI" w:cs="Microsoft YaHei UI" w:eastAsia="Microsoft YaHei UI" w:hAnsi="Microsoft YaHei UI"/>
-          <w:color w:val="152625"/>
-          <w:sz w:val="21"/>
-          <w:szCs w:val="21"/>
-        </w:rPr>
-        <w:t xml:space="preserve">甲磺酸多沙唑嗪 / doxazosin mesylate / C24H29N5O8S（1 条）</w:t>
-      </w:r>
-    </w:p>
-    <w:p>
-      <w:pPr>
-        <w:pStyle w:val="ListParagraph"/>
-        <w:numPr>
-          <w:ilvl w:val="0"/>
-          <w:numId w:val="1"/>
-        </w:numPr>
-        <w:spacing w:after="80" w:before="0" w:line="340"/>
-      </w:pPr>
-      <w:r>
-        <w:rPr>
-          <w:rFonts w:ascii="Microsoft YaHei UI" w:cs="Microsoft YaHei UI" w:eastAsia="Microsoft YaHei UI" w:hAnsi="Microsoft YaHei UI"/>
-          <w:color w:val="152625"/>
-          <w:sz w:val="21"/>
-          <w:szCs w:val="21"/>
-        </w:rPr>
-        <w:t xml:space="preserve">萘哌地尔 / naftopidil / C24H28N2O3（1 条）</w:t>
-      </w:r>
-    </w:p>
-    <w:p>
-      <w:pPr>
-        <w:pStyle w:val="ListParagraph"/>
-        <w:numPr>
-          <w:ilvl w:val="0"/>
-          <w:numId w:val="1"/>
-        </w:numPr>
-        <w:spacing w:after="80" w:before="0" w:line="340"/>
-      </w:pPr>
-      <w:r>
-        <w:rPr>
-          <w:rFonts w:ascii="Microsoft YaHei UI" w:cs="Microsoft YaHei UI" w:eastAsia="Microsoft YaHei UI" w:hAnsi="Microsoft YaHei UI"/>
-          <w:color w:val="152625"/>
-          <w:sz w:val="21"/>
-          <w:szCs w:val="21"/>
-        </w:rPr>
-        <w:t xml:space="preserve">盐酸特拉唑嗪 / terazosin hydrochloride / C19H30ClN5O6（1 条）</w:t>
+        <w:t xml:space="preserve">盐酸坦索罗辛 / tamsulosin hydrochloride / C20H29ClN2O5S（2 条）</w:t>
       </w:r>
     </w:p>
     <w:p>

</xml_diff>

<commit_message>
Remove recursive search index growth from August site data
</commit_message>
<xml_diff>
--- a/reports/2026-08_cardura_focus_report.docx
+++ b/reports/2026-08_cardura_focus_report.docx
@@ -850,7 +850,7 @@
             <w:pPr>
               <w:spacing w:after="0" w:before="80"/>
             </w:pPr>
-            <w:hyperlink w:history="1" r:id="rIdr6i_b7qmtd0uibv1afnou">
+            <w:hyperlink w:history="1" r:id="rIdyfeya6fltmmax4143y087">
               <w:r>
                 <w:rPr>
                   <w:rFonts w:ascii="Microsoft YaHei UI" w:cs="Microsoft YaHei UI" w:eastAsia="Microsoft YaHei UI" w:hAnsi="Microsoft YaHei UI"/>
@@ -1015,7 +1015,7 @@
             <w:pPr>
               <w:spacing w:after="0" w:before="80"/>
             </w:pPr>
-            <w:hyperlink w:history="1" r:id="rIde8o9euh8bdh5pldk8hnzs">
+            <w:hyperlink w:history="1" r:id="rId6chu8whkj6ohwiwloofmj">
               <w:r>
                 <w:rPr>
                   <w:rFonts w:ascii="Microsoft YaHei UI" w:cs="Microsoft YaHei UI" w:eastAsia="Microsoft YaHei UI" w:hAnsi="Microsoft YaHei UI"/>

</xml_diff>